<commit_message>
chore: update resume redesign exports (ATS/CLI versions)
</commit_message>
<xml_diff>
--- a/resume-redesign/宋林蔚_大模型应用_AI-Agent_简历_ATS.docx
+++ b/resume-redesign/宋林蔚_大模型应用_AI-Agent_简历_ATS.docx
@@ -2,10 +2,11 @@
 <file path=word/document.xml><?xml version="1.0" encoding="utf-8"?>
 <w:document xmlns:w="http://schemas.openxmlformats.org/wordprocessingml/2006/main" xmlns:m="http://schemas.openxmlformats.org/officeDocument/2006/math" xmlns:r="http://schemas.openxmlformats.org/officeDocument/2006/relationships" xmlns:o="urn:schemas-microsoft-com:office:office" xmlns:v="urn:schemas-microsoft-com:vml" xmlns:w10="urn:schemas-microsoft-com:office:word" xmlns:a="http://schemas.openxmlformats.org/drawingml/2006/main" xmlns:pic="http://schemas.openxmlformats.org/drawingml/2006/picture" xmlns:wp="http://schemas.openxmlformats.org/drawingml/2006/wordprocessingDrawing">
   <w:body>
-    <w:bookmarkStart w:id="33" w:name="宋林蔚"/>
+    <w:bookmarkStart w:id="38" w:name="宋林蔚"/>
     <w:p>
       <w:pPr>
         <w:pStyle w:val="Heading1"/>
+        <w:widowControl/>
       </w:pPr>
       <w:r>
         <w:t xml:space="preserve">宋林蔚</w:t>
@@ -14,6 +15,7 @@
     <w:p>
       <w:pPr>
         <w:pStyle w:val="FirstParagraph"/>
+        <w:widowControl/>
       </w:pPr>
       <w:r>
         <w:rPr>
@@ -21,6 +23,12 @@
           <w:b/>
         </w:rPr>
         <w:t xml:space="preserve">大模型应用 / AI Agent 工程师</w:t>
+      </w:r>
+      <w:r>
+        <w:br/>
+      </w:r>
+      <w:r>
+        <w:t xml:space="preserve">出生 2001.09 ｜ 现居 福建 · 福州</w:t>
       </w:r>
       <w:r>
         <w:br/>
@@ -57,35 +65,38 @@
         </w:r>
       </w:hyperlink>
     </w:p>
-    <w:bookmarkStart w:id="22" w:name="个人概述"/>
+    <w:bookmarkStart w:id="24" w:name="实习经历"/>
     <w:p>
       <w:pPr>
         <w:pStyle w:val="Heading2"/>
-      </w:pPr>
-      <w:r>
-        <w:t xml:space="preserve">个人概述</w:t>
+        <w:widowControl/>
+      </w:pPr>
+      <w:r>
+        <w:t xml:space="preserve">实习经历</w:t>
+      </w:r>
+    </w:p>
+    <w:bookmarkStart w:id="22" w:name="友达光电卓越工程师计划-ai-专案实习生"/>
+    <w:p>
+      <w:pPr>
+        <w:pStyle w:val="Heading3"/>
+        <w:widowControl/>
+      </w:pPr>
+      <w:r>
+        <w:t xml:space="preserve">友达光电｜卓越工程师计划 · AI 专案实习生</w:t>
       </w:r>
     </w:p>
     <w:p>
       <w:pPr>
         <w:pStyle w:val="FirstParagraph"/>
-      </w:pPr>
-      <w:r>
-        <w:t xml:space="preserve">软件工程硕士在读，具备 8 个月企业智能客服 RAG 项目实践，覆盖文档切分、索引策略、Embedding/Rerank、模型部署、Agent Workflow、Prompt 迭代与问答评测。持续构建本地 Agent、上下文与记忆系统，能够把大模型能力落到可运行、可评测、可调试的工程链路。LLM 多跳信息检索方向一作论文投稿 EMNLP 2026，ARR 审稿已返回（3.5 / 3.0 / 2.5）。</w:t>
-      </w:r>
-    </w:p>
-    <w:bookmarkEnd w:id="22"/>
-    <w:bookmarkStart w:id="23" w:name="核心亮点"/>
-    <w:p>
-      <w:pPr>
-        <w:pStyle w:val="Heading2"/>
-      </w:pPr>
-      <w:r>
-        <w:t xml:space="preserve">核心亮点</w:t>
-      </w:r>
-    </w:p>
-    <w:p>
-      <w:pPr>
+        <w:widowControl/>
+      </w:pPr>
+      <w:r>
+        <w:t xml:space="preserve">2026.07—至今</w:t>
+      </w:r>
+    </w:p>
+    <w:p>
+      <w:pPr>
+        <w:widowControl/>
         <w:numPr>
           <w:ilvl w:val="0"/>
           <w:numId w:val="1001"/>
@@ -93,11 +104,12 @@
         <w:pStyle w:val="Compact"/>
       </w:pPr>
       <w:r>
-        <w:t xml:space="preserve">第十七届蓝桥杯人工智能赛·智能体开发赛道：国赛一等奖、全国第 5 名；省赛一等奖、福建省第 1 名。</w:t>
-      </w:r>
-    </w:p>
-    <w:p>
-      <w:pPr>
+        <w:t>负责 FIDM 新产品 SOP 智撰方案：将跨站点 key-in、贴图与审核拆为 Model SOP 包和站点级 OI Draft，覆盖结构化 Step、参数、质量点、图片与来源追踪；业务目标为编写耗时约 −50%、OI 自动生成准确率 ≥90%。</w:t>
+      </w:r>
+    </w:p>
+    <w:p>
+      <w:pPr>
+        <w:widowControl/>
         <w:numPr>
           <w:ilvl w:val="0"/>
           <w:numId w:val="1001"/>
@@ -105,26 +117,12 @@
         <w:pStyle w:val="Compact"/>
       </w:pPr>
       <w:r>
-        <w:t xml:space="preserve">Local Window Copilot：将 VLM 分析成功率由 54% 提升至 80%，将</w:t>
-      </w:r>
-      <w:r>
-        <w:t xml:space="preserve"> </w:t>
-      </w:r>
-      <w:r>
-        <w:rPr>
-          <w:rStyle w:val="VerbatimChar"/>
-        </w:rPr>
-        <w:t xml:space="preserve">memory.search</w:t>
-      </w:r>
-      <w:r>
-        <w:t xml:space="preserve"> </w:t>
-      </w:r>
-      <w:r>
-        <w:t xml:space="preserve">失败率由 46% 降至 0%，排名延迟由约 30 秒降至约 10 毫秒。</w:t>
-      </w:r>
-    </w:p>
-    <w:p>
-      <w:pPr>
+        <w:t>在不使用企业数据的前提下，独立重构 OpenSOP-Agent 开源验证原型：元数据过滤 → Dense/Lexical 混合检索 → RRF/重排 → 完整历史路线复用；规则锁定 Step 顺序、数值来源、引用白名单与图片确认，避免跨 SOP 拼接和无依据参数。</w:t>
+      </w:r>
+    </w:p>
+    <w:p>
+      <w:pPr>
+        <w:widowControl/>
         <w:numPr>
           <w:ilvl w:val="0"/>
           <w:numId w:val="1001"/>
@@ -132,23 +130,25 @@
         <w:pStyle w:val="Compact"/>
       </w:pPr>
       <w:r>
-        <w:t xml:space="preserve">一作研究 LLM 多跳信息检索，EMNLP 2026 投稿，ARR 三位审稿人评分为 3.5 / 3.0 / 2.5。</w:t>
-      </w:r>
-    </w:p>
-    <w:bookmarkEnd w:id="23"/>
-    <w:bookmarkStart w:id="25" w:name="实习经历"/>
-    <w:p>
-      <w:pPr>
-        <w:pStyle w:val="Heading2"/>
-      </w:pPr>
-      <w:r>
-        <w:t xml:space="preserve">实习经历</w:t>
-      </w:r>
-    </w:p>
-    <w:bookmarkStart w:id="24" w:name="福建新意科技有限公司大模型应用开发实习生"/>
+        <w:t>以 LangGraph 编排需求理解、证据规划、Draft、校验/修复及工程/质量审核；构建 40 份历史 OI、324 条 Step、80 个媒体资产、24 条 Lesson 与 12 个隔离任务做回归，支持 Excel/ZIP 导出和 Lesson 回写。</w:t>
+      </w:r>
+      <w:hyperlink r:id="rId9">
+        <w:r>
+          <w:rPr>
+            <w:color w:val="0563C1"/>
+            <w:b/>
+            <w:u w:val="none"/>
+          </w:rPr>
+          <w:t> GitHub</w:t>
+        </w:r>
+      </w:hyperlink>
+    </w:p>
+    <w:bookmarkEnd w:id="22"/>
+    <w:bookmarkStart w:id="23" w:name="福建新意科技有限公司大模型应用开发实习生"/>
     <w:p>
       <w:pPr>
         <w:pStyle w:val="Heading3"/>
+        <w:widowControl/>
       </w:pPr>
       <w:r>
         <w:t xml:space="preserve">福建新意科技有限公司｜大模型应用开发实习生</w:t>
@@ -157,6 +157,7 @@
     <w:p>
       <w:pPr>
         <w:pStyle w:val="FirstParagraph"/>
+        <w:widowControl/>
       </w:pPr>
       <w:r>
         <w:t xml:space="preserve">2025.07—2026.02</w:t>
@@ -164,6 +165,7 @@
     </w:p>
     <w:p>
       <w:pPr>
+        <w:widowControl/>
         <w:numPr>
           <w:ilvl w:val="0"/>
           <w:numId w:val="1002"/>
@@ -171,11 +173,12 @@
         <w:pStyle w:val="Compact"/>
       </w:pPr>
       <w:r>
-        <w:t xml:space="preserve">基于 Dify 参与企业智能客服 RAG 问答链路建设，覆盖业务知识梳理、知识库配置、模型接入、Workflow 编排、Prompt 迭代及效果评估。</w:t>
-      </w:r>
-    </w:p>
-    <w:p>
-      <w:pPr>
+        <w:t xml:space="preserve">企业智能客服 RAG 从 0 到可用：梳理业务知识、搭 Dify Workflow、接多模型 API，并持续迭代 Prompt 与命中效果。</w:t>
+      </w:r>
+    </w:p>
+    <w:p>
+      <w:pPr>
+        <w:widowControl/>
         <w:numPr>
           <w:ilvl w:val="0"/>
           <w:numId w:val="1002"/>
@@ -183,11 +186,12 @@
         <w:pStyle w:val="Compact"/>
       </w:pPr>
       <w:r>
-        <w:t xml:space="preserve">面向层级复杂且持续迭代的长文档，设计树状知识切分与全文索引方案；对比普通分段、父子索引等策略在召回率、命中准确性和答案完整性上的表现，并依据测试结果优化知识库配置。</w:t>
-      </w:r>
-    </w:p>
-    <w:p>
-      <w:pPr>
+        <w:t xml:space="preserve">长文档层级深、版本更新快，平铺切分会丢父子结构。设计树状切分 + 全文索引，用召回/命中/答案完整性对比「普通分段 vs 父子索引」后定版。</w:t>
+      </w:r>
+    </w:p>
+    <w:p>
+      <w:pPr>
+        <w:widowControl/>
         <w:numPr>
           <w:ilvl w:val="0"/>
           <w:numId w:val="1002"/>
@@ -195,11 +199,12 @@
         <w:pStyle w:val="Compact"/>
       </w:pPr>
       <w:r>
-        <w:t xml:space="preserve">完成 Qwen-32B 的 vLLM 本地部署，以及 CPU 环境下 Embedding 与 Rerank 模型的 Xinference 部署；参与 MCP 工具接入、多供应商兼容 API 调试与常见故障排查。</w:t>
-      </w:r>
-    </w:p>
-    <w:p>
-      <w:pPr>
+        <w:t xml:space="preserve">本地部署 Qwen-32B（vLLM），CPU 侧用 Xinference 跑 Embedding/Rerank；接 MCP 与多供应商接口并完成故障排查。</w:t>
+      </w:r>
+    </w:p>
+    <w:p>
+      <w:pPr>
+        <w:widowControl/>
         <w:numPr>
           <w:ilvl w:val="0"/>
           <w:numId w:val="1002"/>
@@ -207,24 +212,26 @@
         <w:pStyle w:val="Compact"/>
       </w:pPr>
       <w:r>
-        <w:t xml:space="preserve">构建包含 20 个典型业务问题的小样本评测集，对 DeepSeek、豆包等模型的准确性、证据相关性、完整性和输出稳定性进行采样评估，沉淀失败案例并迭代 Prompt、知识库与模型选型。</w:t>
-      </w:r>
-    </w:p>
+        <w:t xml:space="preserve">自建 20 题业务评测集（准确性、证据相关性、完整性、稳定性），对比 DeepSeek / 豆包等，用失败 case 反推知识库与选型。</w:t>
+      </w:r>
+    </w:p>
+    <w:bookmarkEnd w:id="23"/>
     <w:bookmarkEnd w:id="24"/>
-    <w:bookmarkEnd w:id="25"/>
-    <w:bookmarkStart w:id="30" w:name="项目经历"/>
+    <w:bookmarkStart w:id="27" w:name="项目经验"/>
     <w:p>
       <w:pPr>
         <w:pStyle w:val="Heading2"/>
-      </w:pPr>
-      <w:r>
-        <w:t xml:space="preserve">项目经历</w:t>
-      </w:r>
-    </w:p>
-    <w:bookmarkStart w:id="27" w:name="local-window-copilotwindows-本地桌面-agent"/>
+        <w:widowControl/>
+      </w:pPr>
+      <w:r>
+        <w:t xml:space="preserve">项目经验</w:t>
+      </w:r>
+    </w:p>
+    <w:bookmarkStart w:id="26" w:name="local-window-copilotwindows-本地桌面-agent"/>
     <w:p>
       <w:pPr>
         <w:pStyle w:val="Heading3"/>
+        <w:widowControl/>
       </w:pPr>
       <w:r>
         <w:t xml:space="preserve">Local Window Copilot｜Windows 本地桌面 Agent</w:t>
@@ -233,6 +240,7 @@
     <w:p>
       <w:pPr>
         <w:pStyle w:val="FirstParagraph"/>
+        <w:widowControl/>
       </w:pPr>
       <w:r>
         <w:t xml:space="preserve">2026.07—至今 ｜</w:t>
@@ -240,7 +248,7 @@
       <w:r>
         <w:t xml:space="preserve"> </w:t>
       </w:r>
-      <w:hyperlink r:id="rId26">
+      <w:hyperlink r:id="rId25">
         <w:r>
           <w:rPr>
             <w:rStyle w:val="Hyperlink"/>
@@ -251,6 +259,7 @@
     </w:p>
     <w:p>
       <w:pPr>
+        <w:widowControl/>
         <w:numPr>
           <w:ilvl w:val="0"/>
           <w:numId w:val="1003"/>
@@ -258,23 +267,12 @@
         <w:pStyle w:val="Compact"/>
       </w:pPr>
       <w:r>
-        <w:t xml:space="preserve">构建</w:t>
-      </w:r>
-      <w:r>
-        <w:t xml:space="preserve">“</w:t>
-      </w:r>
-      <w:r>
-        <w:t xml:space="preserve">截图观察—VLM 结构化分析—SQLite 存储—FTS5/BM25 检索—ChatAgent 回答</w:t>
-      </w:r>
-      <w:r>
-        <w:t xml:space="preserve">”</w:t>
-      </w:r>
-      <w:r>
-        <w:t xml:space="preserve">的本地 Agent 链路，以 FastAPI/SSE 提供运行时与流式交互，并按 system、profile、session、evidence 分层组织上下文。</w:t>
-      </w:r>
-    </w:p>
-    <w:p>
-      <w:pPr>
+        <w:t xml:space="preserve">独立实现 local-first Windows 桌面 Copilot：Win32 透明置顶悬浮窗（自动排除截屏）观察前台应用，MiniCPM-V 产出结构化证据，llama.cpp + FastAPI/SSE 完成本地流式对话。</w:t>
+      </w:r>
+    </w:p>
+    <w:p>
+      <w:pPr>
+        <w:widowControl/>
         <w:numPr>
           <w:ilvl w:val="0"/>
           <w:numId w:val="1003"/>
@@ -282,26 +280,12 @@
         <w:pStyle w:val="Compact"/>
       </w:pPr>
       <w:r>
-        <w:t xml:space="preserve">重构 probe→stream 决策与流式工具调用循环，使小 VLM 的工具调用与回答职责解耦；以确定性检索替代 VLM ranker，将</w:t>
-      </w:r>
-      <w:r>
-        <w:t xml:space="preserve"> </w:t>
-      </w:r>
-      <w:r>
-        <w:rPr>
-          <w:rStyle w:val="VerbatimChar"/>
-        </w:rPr>
-        <w:t xml:space="preserve">memory.search</w:t>
-      </w:r>
-      <w:r>
-        <w:t xml:space="preserve"> </w:t>
-      </w:r>
-      <w:r>
-        <w:t xml:space="preserve">失败率由 46% 降至 0%，排名延迟由约 30 秒降至约 10 毫秒。</w:t>
-      </w:r>
-    </w:p>
-    <w:p>
-      <w:pPr>
+        <w:t xml:space="preserve">将观察与对话解耦：后台只沉淀带 record_id / 截图的证据，不默认注入 prompt；模型仅通过 memory.search 按需检索，避免陈旧观察污染并让回答可追溯。</w:t>
+      </w:r>
+    </w:p>
+    <w:p>
+      <w:pPr>
+        <w:widowControl/>
         <w:numPr>
           <w:ilvl w:val="0"/>
           <w:numId w:val="1003"/>
@@ -309,40 +293,95 @@
         <w:pStyle w:val="Compact"/>
       </w:pPr>
       <w:r>
-        <w:t xml:space="preserve">冻结会话级 profile 快照以稳定命中 llama.cpp KV cache，使首 Token 延迟下降 30%–60%；精简观察 Prompt 契约，将 VLM 分析成功率由 54% 提升至 80%，并以 55 项单元测试覆盖核心链路。</w:t>
-      </w:r>
-    </w:p>
+        <w:t xml:space="preserve">针对 MiniCPM-V function calling 不稳，设计 probe→stream(+tool loop)：probe 只认结构化 tool_calls，stream 保留二次取证机会；以 FTS5/BM25 + 中文 bigram 替换 VLM reranker，将证据排序从 12–30s 降至毫秒级。</w:t>
+      </w:r>
+    </w:p>
+    <w:p>
+      <w:pPr>
+        <w:widowControl/>
+        <w:numPr>
+          <w:ilvl w:val="0"/>
+          <w:numId w:val="1003"/>
+        </w:numPr>
+        <w:pStyle w:val="Compact"/>
+      </w:pPr>
+      <w:r>
+        <w:t xml:space="preserve">构建本地长上下文治理：冻结 system/profile 前缀复用 llama.cpp KV cache，加入分段 token 账本、请求前拦截、工具结果预算与 rolling compact；WebUI 可回放证据/调用/压缩/日志，263/263 项测试通过。</w:t>
+      </w:r>
+    </w:p>
+    <w:bookmarkEnd w:id="26"/>
     <w:bookmarkEnd w:id="27"/>
-    <w:bookmarkStart w:id="29" w:name="silentdeck静音视频自动讲解-agent-skill"/>
+    <w:bookmarkStart w:id="32" w:name="竞赛获奖"/>
+    <w:p>
+      <w:pPr>
+        <w:pStyle w:val="Heading2"/>
+        <w:widowControl/>
+      </w:pPr>
+      <w:r>
+        <w:t xml:space="preserve">竞赛获奖</w:t>
+      </w:r>
+    </w:p>
+    <w:bookmarkStart w:id="31" w:name="第十七届蓝桥杯全国大学生软件和信息技术大赛"/>
     <w:p>
       <w:pPr>
         <w:pStyle w:val="Heading3"/>
-      </w:pPr>
-      <w:r>
-        <w:t xml:space="preserve">SilentDeck｜静音视频自动讲解 Agent Skill</w:t>
-      </w:r>
-    </w:p>
-    <w:p>
-      <w:pPr>
-        <w:pStyle w:val="FirstParagraph"/>
-      </w:pPr>
-      <w:r>
-        <w:t xml:space="preserve">2026.04—2026.05 ｜</w:t>
-      </w:r>
-      <w:r>
-        <w:t xml:space="preserve"> </w:t>
+        <w:widowControl/>
+      </w:pPr>
+      <w:r>
+        <w:t xml:space="preserve">第十七届蓝桥杯全国大学生软件和信息技术大赛</w:t>
+      </w:r>
+    </w:p>
+    <w:p>
+      <w:pPr>
+        <w:widowControl/>
+        <w:numPr>
+          <w:ilvl w:val="0"/>
+          <w:numId w:val="1004"/>
+        </w:numPr>
+        <w:pStyle w:val="Compact"/>
+      </w:pPr>
+      <w:r>
+        <w:rPr>
+          <w:bCs/>
+          <w:b/>
+        </w:rPr>
+        <w:t xml:space="preserve">全国总决赛 · 一等奖 · 全国第 5 名</w:t>
+      </w:r>
+      <w:r>
+        <w:t xml:space="preserve">（人工智能赛 · 智能体开发大学组）</w:t>
+      </w:r>
+      <w:r>
+        <w:br/>
       </w:r>
       <w:hyperlink r:id="rId28">
         <w:r>
           <w:rPr>
             <w:rStyle w:val="Hyperlink"/>
           </w:rPr>
-          <w:t xml:space="preserve">GitHub</w:t>
+          <w:t xml:space="preserve">国赛获奖名单</w:t>
         </w:r>
       </w:hyperlink>
-    </w:p>
-    <w:p>
-      <w:pPr>
+      <w:r>
+        <w:t xml:space="preserve"> </w:t>
+      </w:r>
+      <w:r>
+        <w:t xml:space="preserve">｜</w:t>
+      </w:r>
+      <w:r>
+        <w:t xml:space="preserve"> </w:t>
+      </w:r>
+      <w:hyperlink r:id="rId29">
+        <w:r>
+          <w:rPr>
+            <w:rStyle w:val="Hyperlink"/>
+          </w:rPr>
+          <w:t xml:space="preserve">证书核验</w:t>
+        </w:r>
+      </w:hyperlink>
+    </w:p>
+    <w:p>
+      <w:pPr>
+        <w:widowControl/>
         <w:numPr>
           <w:ilvl w:val="0"/>
           <w:numId w:val="1004"/>
@@ -350,34 +389,136 @@
         <w:pStyle w:val="Compact"/>
       </w:pPr>
       <w:r>
-        <w:t xml:space="preserve">设计 agent-first 自动化流程，串联关键帧抽取、VLM 视觉分析、LLM 讲稿生成、TTS 语音合成与 FFmpeg 封装，实现从静音 MP4 到 narrated MP4 与字幕的端到端生成。</w:t>
-      </w:r>
-    </w:p>
-    <w:p>
-      <w:pPr>
-        <w:numPr>
-          <w:ilvl w:val="0"/>
-          <w:numId w:val="1004"/>
-        </w:numPr>
-        <w:pStyle w:val="Compact"/>
-      </w:pPr>
-      <w:r>
-        <w:t xml:space="preserve">接入 SiliconFlow 兼容 API，支持可配置的 VLM、文本与 TTS 模型，并通过环境变量统一管理 API Key、模型 ID 和 FFmpeg 路径。</w:t>
-      </w:r>
-    </w:p>
-    <w:bookmarkEnd w:id="29"/>
-    <w:bookmarkEnd w:id="30"/>
-    <w:bookmarkStart w:id="31" w:name="技术能力"/>
+        <w:rPr>
+          <w:bCs/>
+          <w:b/>
+        </w:rPr>
+        <w:t xml:space="preserve">福建赛区省赛 · 一等奖 · 福建省第 1 名 · 晋级国赛</w:t>
+      </w:r>
+      <w:r>
+        <w:br/>
+      </w:r>
+      <w:hyperlink r:id="rId30">
+        <w:r>
+          <w:rPr>
+            <w:rStyle w:val="Hyperlink"/>
+          </w:rPr>
+          <w:t xml:space="preserve">省赛获奖名单</w:t>
+        </w:r>
+      </w:hyperlink>
+      <w:r>
+        <w:t xml:space="preserve"> </w:t>
+      </w:r>
+      <w:r>
+        <w:t xml:space="preserve">｜</w:t>
+      </w:r>
+      <w:r>
+        <w:t xml:space="preserve"> </w:t>
+      </w:r>
+      <w:hyperlink r:id="rId29">
+        <w:r>
+          <w:rPr>
+            <w:rStyle w:val="Hyperlink"/>
+          </w:rPr>
+          <w:t xml:space="preserve">证书核验</w:t>
+        </w:r>
+      </w:hyperlink>
+    </w:p>
+    <w:bookmarkEnd w:id="31"/>
+    <w:bookmarkEnd w:id="32"/>
+    <w:bookmarkStart w:id="33" w:name="教育背景"/>
     <w:p>
       <w:pPr>
         <w:pStyle w:val="Heading2"/>
-      </w:pPr>
-      <w:r>
-        <w:t xml:space="preserve">技术能力</w:t>
-      </w:r>
-    </w:p>
-    <w:p>
-      <w:pPr>
+        <w:widowControl/>
+      </w:pPr>
+      <w:r>
+        <w:t xml:space="preserve">教育背景</w:t>
+      </w:r>
+    </w:p>
+    <w:p>
+      <w:pPr>
+        <w:pStyle w:val="FirstParagraph"/>
+        <w:widowControl/>
+      </w:pPr>
+      <w:r>
+        <w:rPr>
+          <w:bCs/>
+          <w:b/>
+        </w:rPr>
+        <w:t xml:space="preserve">福建师范大学｜软件工程硕士</w:t>
+      </w:r>
+      <w:r>
+        <w:t xml:space="preserve"> </w:t>
+      </w:r>
+      <w:r>
+        <w:t xml:space="preserve">｜ 2025.09—至今</w:t>
+      </w:r>
+      <w:r>
+        <w:br/>
+      </w:r>
+      <w:r>
+        <w:t xml:space="preserve">2025 年研究生一等奖学业奖学金</w:t>
+      </w:r>
+    </w:p>
+    <w:p>
+      <w:pPr>
+        <w:pStyle w:val="BodyText"/>
+        <w:widowControl/>
+      </w:pPr>
+      <w:r>
+        <w:rPr>
+          <w:bCs/>
+          <w:b/>
+        </w:rPr>
+        <w:t xml:space="preserve">福州大学至诚学院｜计算机科学与技术（本科）</w:t>
+      </w:r>
+      <w:r>
+        <w:t xml:space="preserve"> </w:t>
+      </w:r>
+      <w:r>
+        <w:t xml:space="preserve">｜ 2020.09—2024.06</w:t>
+      </w:r>
+      <w:r>
+        <w:br/>
+      </w:r>
+      <w:r>
+        <w:t xml:space="preserve">英语六级（CET-6），可独立阅读英文论文与技术文档</w:t>
+      </w:r>
+    </w:p>
+    <w:bookmarkEnd w:id="33"/>
+    <w:bookmarkStart w:id="36" w:name="论文"/>
+    <w:p>
+      <w:pPr>
+        <w:pStyle w:val="Heading2"/>
+        <w:widowControl/>
+      </w:pPr>
+      <w:r>
+        <w:t xml:space="preserve">论文</w:t>
+      </w:r>
+    </w:p>
+    <w:bookmarkStart w:id="34" w:name="X15a590f492dab311689c6ace60a590ac45a3703"/>
+    <w:p>
+      <w:pPr>
+        <w:pStyle w:val="Heading3"/>
+        <w:widowControl/>
+      </w:pPr>
+      <w:r>
+        <w:t xml:space="preserve">1. Intrinsic Attention as Navigator: A Non-Generative Retrieval Method for Multi-Hop Queries</w:t>
+      </w:r>
+    </w:p>
+    <w:p>
+      <w:pPr>
+        <w:pStyle w:val="FirstParagraph"/>
+        <w:widowControl/>
+      </w:pPr>
+      <w:r>
+        <w:t xml:space="preserve">一作 · EMNLP 2026（CCF-B）· 等待 Meta Review</w:t>
+      </w:r>
+    </w:p>
+    <w:p>
+      <w:pPr>
+        <w:widowControl/>
         <w:numPr>
           <w:ilvl w:val="0"/>
           <w:numId w:val="1005"/>
@@ -385,21 +526,12 @@
         <w:pStyle w:val="Compact"/>
       </w:pPr>
       <w:r>
-        <w:rPr>
-          <w:bCs/>
-          <w:b/>
-        </w:rPr>
-        <w:t xml:space="preserve">LLM 应用：</w:t>
-      </w:r>
-      <w:r>
-        <w:t xml:space="preserve"> </w:t>
-      </w:r>
-      <w:r>
-        <w:t xml:space="preserve">RAG、AI Agent、Prompt Engineering、Tool Calling、结构化输出、Agent Workflow、模型评测、MCP</w:t>
-      </w:r>
-    </w:p>
-    <w:p>
-      <w:pPr>
+        <w:t xml:space="preserve">发现 Embedding 模型 elite attention heads 可稳定定位跨文档桥接线索，实现无需 CoT、训练或预构图的 next-hop 检索。</w:t>
+      </w:r>
+    </w:p>
+    <w:p>
+      <w:pPr>
+        <w:widowControl/>
         <w:numPr>
           <w:ilvl w:val="0"/>
           <w:numId w:val="1005"/>
@@ -407,21 +539,12 @@
         <w:pStyle w:val="Compact"/>
       </w:pPr>
       <w:r>
-        <w:rPr>
-          <w:bCs/>
-          <w:b/>
-        </w:rPr>
-        <w:t xml:space="preserve">框架与平台：</w:t>
-      </w:r>
-      <w:r>
-        <w:t xml:space="preserve"> </w:t>
-      </w:r>
-      <w:r>
-        <w:t xml:space="preserve">LangChain、LangGraph、LangSmith、Dify、FastGPT</w:t>
-      </w:r>
-    </w:p>
-    <w:p>
-      <w:pPr>
+        <w:t xml:space="preserve">指令激活桥接 clue；semantic residual 逐跳扣除已覆盖语义，beam 保留多路径，避免检索停留在原问题语义邻域。</w:t>
+      </w:r>
+    </w:p>
+    <w:p>
+      <w:pPr>
+        <w:widowControl/>
         <w:numPr>
           <w:ilvl w:val="0"/>
           <w:numId w:val="1005"/>
@@ -429,99 +552,32 @@
         <w:pStyle w:val="Compact"/>
       </w:pPr>
       <w:r>
-        <w:rPr>
-          <w:bCs/>
-          <w:b/>
-        </w:rPr>
-        <w:t xml:space="preserve">检索与记忆：</w:t>
-      </w:r>
-      <w:r>
-        <w:t xml:space="preserve"> </w:t>
-      </w:r>
-      <w:r>
-        <w:t xml:space="preserve">Embedding、Rerank、Qdrant、Redis Vector Search、SQLite FTS5、BM25</w:t>
-      </w:r>
-    </w:p>
-    <w:p>
-      <w:pPr>
-        <w:numPr>
-          <w:ilvl w:val="0"/>
-          <w:numId w:val="1005"/>
-        </w:numPr>
-        <w:pStyle w:val="Compact"/>
-      </w:pPr>
-      <w:r>
-        <w:rPr>
-          <w:bCs/>
-          <w:b/>
-        </w:rPr>
-        <w:t xml:space="preserve">工程与部署：</w:t>
-      </w:r>
-      <w:r>
-        <w:t xml:space="preserve"> </w:t>
-      </w:r>
-      <w:r>
-        <w:t xml:space="preserve">Python、FastAPI、PostgreSQL、Redis、SSE、vLLM、llama.cpp、Xinference、FFmpeg</w:t>
-      </w:r>
-    </w:p>
-    <w:p>
-      <w:pPr>
-        <w:numPr>
-          <w:ilvl w:val="0"/>
-          <w:numId w:val="1005"/>
-        </w:numPr>
-        <w:pStyle w:val="Compact"/>
-      </w:pPr>
-      <w:r>
-        <w:rPr>
-          <w:bCs/>
-          <w:b/>
-        </w:rPr>
-        <w:t xml:space="preserve">模型与 API：</w:t>
-      </w:r>
-      <w:r>
-        <w:t xml:space="preserve"> </w:t>
-      </w:r>
-      <w:r>
-        <w:t xml:space="preserve">OpenAI / Anthropic / SiliconFlow 兼容 API、Qwen、MiniCPM-V、多供应商 LLM / Embedding Client 封装</w:t>
-      </w:r>
-    </w:p>
-    <w:bookmarkEnd w:id="31"/>
-    <w:bookmarkStart w:id="32" w:name="教育与荣誉"/>
-    <w:p>
-      <w:pPr>
-        <w:pStyle w:val="Heading2"/>
-      </w:pPr>
-      <w:r>
-        <w:t xml:space="preserve">教育与荣誉</w:t>
+        <w:t xml:space="preserve">Qwen3-Embedding-4B 在 2Wiki / MuSiQue 的 R@5 达 89.10 / 76.45，相对 Direct +16.28 / +12.65，并超过 8B 直检；移除 intrinsic steering 后分别下降 18.0 / 9.7 点。ARR 评分 3.5 / 3.0 / 2.5，当前等待 Meta Review。</w:t>
+      </w:r>
+    </w:p>
+    <w:bookmarkEnd w:id="34"/>
+    <w:bookmarkStart w:id="35" w:name="X33166e962634bd28863700d5a1affa06ed0ab9e"/>
+    <w:p>
+      <w:pPr>
+        <w:pStyle w:val="Heading3"/>
+        <w:widowControl/>
+      </w:pPr>
+      <w:r>
+        <w:t xml:space="preserve">2. ESRA: Training-Free Multi-Hop Agentic RAG with Explicit Evidence-State Transitions</w:t>
       </w:r>
     </w:p>
     <w:p>
       <w:pPr>
         <w:pStyle w:val="FirstParagraph"/>
-      </w:pPr>
-      <w:r>
-        <w:rPr>
-          <w:bCs/>
-          <w:b/>
-        </w:rPr>
-        <w:t xml:space="preserve">福建师范大学｜软件工程硕士</w:t>
-      </w:r>
-      <w:r>
-        <w:t xml:space="preserve"> </w:t>
-      </w:r>
-      <w:r>
-        <w:t xml:space="preserve">｜ 2025.09—至今</w:t>
-      </w:r>
-      <w:r>
-        <w:br/>
-      </w:r>
-      <w:r>
-        <w:t xml:space="preserve">研究方向：大模型应用、RAG 知识库问答、AI Agent 工程化</w:t>
-      </w:r>
-    </w:p>
-    <w:p>
-      <w:pPr>
+        <w:widowControl/>
+      </w:pPr>
+      <w:r>
+        <w:t xml:space="preserve">AI Open（JCR Q1）· 在投</w:t>
+      </w:r>
+    </w:p>
+    <w:p>
+      <w:pPr>
+        <w:widowControl/>
         <w:numPr>
           <w:ilvl w:val="0"/>
           <w:numId w:val="1006"/>
@@ -529,11 +585,12 @@
         <w:pStyle w:val="Compact"/>
       </w:pPr>
       <w:r>
-        <w:t xml:space="preserve">2025 年研究生一等奖学业奖学金</w:t>
-      </w:r>
-    </w:p>
-    <w:p>
-      <w:pPr>
+        <w:t xml:space="preserve">将多跳 Agent 的瓶颈定位为证据状态失控：自然语言轨迹无法约束当前关系、分支和答案槽，易状态漂移与跨分支串证据。</w:t>
+      </w:r>
+    </w:p>
+    <w:p>
+      <w:pPr>
+        <w:widowControl/>
         <w:numPr>
           <w:ilvl w:val="0"/>
           <w:numId w:val="1006"/>
@@ -541,12 +598,49 @@
         <w:pStyle w:val="Compact"/>
       </w:pPr>
       <w:r>
-        <w:t xml:space="preserve">英语六级，具备英文技术文档与论文阅读能力</w:t>
-      </w:r>
-    </w:p>
-    <w:bookmarkEnd w:id="32"/>
-    <w:bookmarkEnd w:id="33"/>
-    <w:sectPr/>
+        <w:t xml:space="preserve">PlanState 定位 branch/step，Search/Probe 构造带来源候选，Workspace 保存完整输出、只显当前分支；经校验的 candidate commit 写回，并区分候选构建/提交错误。</w:t>
+      </w:r>
+    </w:p>
+    <w:p>
+      <w:pPr>
+        <w:widowControl/>
+        <w:numPr>
+          <w:ilvl w:val="0"/>
+          <w:numId w:val="1006"/>
+        </w:numPr>
+        <w:pStyle w:val="Compact"/>
+      </w:pPr>
+      <w:r>
+        <w:t xml:space="preserve">同骨干/索引下三数据集均优于 Direct、Standard RAG、IR-CoT、MA-RAG；bridge-comparison F1 0.889 vs 0.674，工具 observation −90.4%；移除 Workspace 后 Avg F1 0.673→0.208、loops 5.10→10.52。</w:t>
+      </w:r>
+    </w:p>
+    <w:bookmarkEnd w:id="35"/>
+    <w:bookmarkEnd w:id="36"/>
+    <w:bookmarkStart w:id="37" w:name="技能特长"/>
+    <w:p>
+      <w:pPr>
+        <w:pStyle w:val="Heading2"/>
+        <w:widowControl/>
+      </w:pPr>
+      <w:r>
+        <w:t xml:space="preserve">技能特长</w:t>
+      </w:r>
+    </w:p>
+    <w:p>
+      <w:pPr>
+        <w:pStyle w:val="FirstParagraph"/>
+        <w:widowControl/>
+      </w:pPr>
+      <w:r>
+        <w:t xml:space="preserve">RAG 工程 · AI Agent · Tool Calling · Agent Workflow · LangGraph / LangChain · Dify · FastAPI · Python · 本地模型部署 · 评测与迭代</w:t>
+      </w:r>
+    </w:p>
+    <w:bookmarkEnd w:id="37"/>
+    <w:bookmarkEnd w:id="38"/>
+    <w:sectPr>
+      <w:pgSz w:w="11906" w:h="16838"/>
+      <w:pgMar w:top="680" w:bottom="680" w:left="907" w:right="907" w:header="340" w:footer="340"/>
+    </w:sectPr>
   </w:body>
 </w:document>
 </file>
@@ -773,6 +867,13 @@
   <w:style w:default="1" w:styleId="Normal" w:type="paragraph">
     <w:name w:val="Normal"/>
     <w:qFormat/>
+    <w:pPr>
+      <w:spacing w:line="240" w:lineRule="auto" w:before="0" w:after="40"/>
+    </w:pPr>
+    <w:rPr>
+      <w:rFonts w:ascii="Arial" w:hAnsi="Arial" w:eastAsia="Microsoft YaHei"/>
+      <w:sz w:val="19"/>
+    </w:rPr>
   </w:style>
   <w:style w:styleId="BodyText" w:type="paragraph">
     <w:name w:val="Body Text"/>
@@ -1219,7 +1320,7 @@
       <w:color w:themeColor="accent1" w:themeShade="BF" w:val="365F91"/>
     </w:rPr>
   </w:style>
-  <w:style w:type="paragraph" w:customStyle="1" w:styleId="SourceCode">
+  <w:style w:customStyle="1" w:styleId="SourceCode" w:type="paragraph">
     <w:name w:val="Source Code"/>
     <w:basedOn w:val="Normal"/>
     <w:link w:val="VerbatimChar"/>
@@ -1227,7 +1328,7 @@
       <w:wordWrap w:val="off"/>
     </w:pPr>
   </w:style>
-  <w:style w:type="character" w:customStyle="1" w:styleId="KeywordTok">
+  <w:style w:customStyle="1" w:styleId="KeywordTok" w:type="character">
     <w:name w:val="KeywordTok"/>
     <w:basedOn w:val="VerbatimChar"/>
     <w:rPr>
@@ -1235,82 +1336,82 @@
       <w:b/>
     </w:rPr>
   </w:style>
-  <w:style w:type="character" w:customStyle="1" w:styleId="DataTypeTok">
+  <w:style w:customStyle="1" w:styleId="DataTypeTok" w:type="character">
     <w:name w:val="DataTypeTok"/>
     <w:basedOn w:val="VerbatimChar"/>
     <w:rPr>
       <w:color w:val="902000"/>
     </w:rPr>
   </w:style>
-  <w:style w:type="character" w:customStyle="1" w:styleId="DecValTok">
+  <w:style w:customStyle="1" w:styleId="DecValTok" w:type="character">
     <w:name w:val="DecValTok"/>
     <w:basedOn w:val="VerbatimChar"/>
     <w:rPr>
       <w:color w:val="40a070"/>
     </w:rPr>
   </w:style>
-  <w:style w:type="character" w:customStyle="1" w:styleId="BaseNTok">
+  <w:style w:customStyle="1" w:styleId="BaseNTok" w:type="character">
     <w:name w:val="BaseNTok"/>
     <w:basedOn w:val="VerbatimChar"/>
     <w:rPr>
       <w:color w:val="40a070"/>
     </w:rPr>
   </w:style>
-  <w:style w:type="character" w:customStyle="1" w:styleId="FloatTok">
+  <w:style w:customStyle="1" w:styleId="FloatTok" w:type="character">
     <w:name w:val="FloatTok"/>
     <w:basedOn w:val="VerbatimChar"/>
     <w:rPr>
       <w:color w:val="40a070"/>
     </w:rPr>
   </w:style>
-  <w:style w:type="character" w:customStyle="1" w:styleId="ConstantTok">
+  <w:style w:customStyle="1" w:styleId="ConstantTok" w:type="character">
     <w:name w:val="ConstantTok"/>
     <w:basedOn w:val="VerbatimChar"/>
     <w:rPr>
       <w:color w:val="880000"/>
     </w:rPr>
   </w:style>
-  <w:style w:type="character" w:customStyle="1" w:styleId="CharTok">
+  <w:style w:customStyle="1" w:styleId="CharTok" w:type="character">
     <w:name w:val="CharTok"/>
     <w:basedOn w:val="VerbatimChar"/>
     <w:rPr>
       <w:color w:val="4070a0"/>
     </w:rPr>
   </w:style>
-  <w:style w:type="character" w:customStyle="1" w:styleId="SpecialCharTok">
+  <w:style w:customStyle="1" w:styleId="SpecialCharTok" w:type="character">
     <w:name w:val="SpecialCharTok"/>
     <w:basedOn w:val="VerbatimChar"/>
     <w:rPr>
       <w:color w:val="4070a0"/>
     </w:rPr>
   </w:style>
-  <w:style w:type="character" w:customStyle="1" w:styleId="StringTok">
+  <w:style w:customStyle="1" w:styleId="StringTok" w:type="character">
     <w:name w:val="StringTok"/>
     <w:basedOn w:val="VerbatimChar"/>
     <w:rPr>
       <w:color w:val="4070a0"/>
     </w:rPr>
   </w:style>
-  <w:style w:type="character" w:customStyle="1" w:styleId="VerbatimStringTok">
+  <w:style w:customStyle="1" w:styleId="VerbatimStringTok" w:type="character">
     <w:name w:val="VerbatimStringTok"/>
     <w:basedOn w:val="VerbatimChar"/>
     <w:rPr>
       <w:color w:val="4070a0"/>
     </w:rPr>
   </w:style>
-  <w:style w:type="character" w:customStyle="1" w:styleId="SpecialStringTok">
+  <w:style w:customStyle="1" w:styleId="SpecialStringTok" w:type="character">
     <w:name w:val="SpecialStringTok"/>
     <w:basedOn w:val="VerbatimChar"/>
     <w:rPr>
       <w:color w:val="bb6688"/>
     </w:rPr>
   </w:style>
-  <w:style w:type="character" w:customStyle="1" w:styleId="ImportTok">
+  <w:style w:customStyle="1" w:styleId="ImportTok" w:type="character">
     <w:name w:val="ImportTok"/>
     <w:basedOn w:val="VerbatimChar"/>
     <w:rPr/>
   </w:style>
-  <w:style w:type="character" w:customStyle="1" w:styleId="CommentTok">
+  <w:style w:customStyle="1" w:styleId="CommentTok" w:type="character">
     <w:name w:val="CommentTok"/>
     <w:basedOn w:val="VerbatimChar"/>
     <w:rPr>
@@ -1318,7 +1419,7 @@
       <w:i/>
     </w:rPr>
   </w:style>
-  <w:style w:type="character" w:customStyle="1" w:styleId="DocumentationTok">
+  <w:style w:customStyle="1" w:styleId="DocumentationTok" w:type="character">
     <w:name w:val="DocumentationTok"/>
     <w:basedOn w:val="VerbatimChar"/>
     <w:rPr>
@@ -1326,7 +1427,7 @@
       <w:i/>
     </w:rPr>
   </w:style>
-  <w:style w:type="character" w:customStyle="1" w:styleId="AnnotationTok">
+  <w:style w:customStyle="1" w:styleId="AnnotationTok" w:type="character">
     <w:name w:val="AnnotationTok"/>
     <w:basedOn w:val="VerbatimChar"/>
     <w:rPr>
@@ -1335,7 +1436,7 @@
       <w:i/>
     </w:rPr>
   </w:style>
-  <w:style w:type="character" w:customStyle="1" w:styleId="CommentVarTok">
+  <w:style w:customStyle="1" w:styleId="CommentVarTok" w:type="character">
     <w:name w:val="CommentVarTok"/>
     <w:basedOn w:val="VerbatimChar"/>
     <w:rPr>
@@ -1344,28 +1445,28 @@
       <w:i/>
     </w:rPr>
   </w:style>
-  <w:style w:type="character" w:customStyle="1" w:styleId="OtherTok">
+  <w:style w:customStyle="1" w:styleId="OtherTok" w:type="character">
     <w:name w:val="OtherTok"/>
     <w:basedOn w:val="VerbatimChar"/>
     <w:rPr>
       <w:color w:val="007020"/>
     </w:rPr>
   </w:style>
-  <w:style w:type="character" w:customStyle="1" w:styleId="FunctionTok">
+  <w:style w:customStyle="1" w:styleId="FunctionTok" w:type="character">
     <w:name w:val="FunctionTok"/>
     <w:basedOn w:val="VerbatimChar"/>
     <w:rPr>
       <w:color w:val="06287e"/>
     </w:rPr>
   </w:style>
-  <w:style w:type="character" w:customStyle="1" w:styleId="VariableTok">
+  <w:style w:customStyle="1" w:styleId="VariableTok" w:type="character">
     <w:name w:val="VariableTok"/>
     <w:basedOn w:val="VerbatimChar"/>
     <w:rPr>
       <w:color w:val="19177c"/>
     </w:rPr>
   </w:style>
-  <w:style w:type="character" w:customStyle="1" w:styleId="ControlFlowTok">
+  <w:style w:customStyle="1" w:styleId="ControlFlowTok" w:type="character">
     <w:name w:val="ControlFlowTok"/>
     <w:basedOn w:val="VerbatimChar"/>
     <w:rPr>
@@ -1373,43 +1474,43 @@
       <w:b/>
     </w:rPr>
   </w:style>
-  <w:style w:type="character" w:customStyle="1" w:styleId="OperatorTok">
+  <w:style w:customStyle="1" w:styleId="OperatorTok" w:type="character">
     <w:name w:val="OperatorTok"/>
     <w:basedOn w:val="VerbatimChar"/>
     <w:rPr>
       <w:color w:val="666666"/>
     </w:rPr>
   </w:style>
-  <w:style w:type="character" w:customStyle="1" w:styleId="BuiltInTok">
+  <w:style w:customStyle="1" w:styleId="BuiltInTok" w:type="character">
     <w:name w:val="BuiltInTok"/>
     <w:basedOn w:val="VerbatimChar"/>
     <w:rPr/>
   </w:style>
-  <w:style w:type="character" w:customStyle="1" w:styleId="ExtensionTok">
+  <w:style w:customStyle="1" w:styleId="ExtensionTok" w:type="character">
     <w:name w:val="ExtensionTok"/>
     <w:basedOn w:val="VerbatimChar"/>
     <w:rPr/>
   </w:style>
-  <w:style w:type="character" w:customStyle="1" w:styleId="PreprocessorTok">
+  <w:style w:customStyle="1" w:styleId="PreprocessorTok" w:type="character">
     <w:name w:val="PreprocessorTok"/>
     <w:basedOn w:val="VerbatimChar"/>
     <w:rPr>
       <w:color w:val="bc7a00"/>
     </w:rPr>
   </w:style>
-  <w:style w:type="character" w:customStyle="1" w:styleId="AttributeTok">
+  <w:style w:customStyle="1" w:styleId="AttributeTok" w:type="character">
     <w:name w:val="AttributeTok"/>
     <w:basedOn w:val="VerbatimChar"/>
     <w:rPr>
       <w:color w:val="7d9029"/>
     </w:rPr>
   </w:style>
-  <w:style w:type="character" w:customStyle="1" w:styleId="RegionMarkerTok">
+  <w:style w:customStyle="1" w:styleId="RegionMarkerTok" w:type="character">
     <w:name w:val="RegionMarkerTok"/>
     <w:basedOn w:val="VerbatimChar"/>
     <w:rPr/>
   </w:style>
-  <w:style w:type="character" w:customStyle="1" w:styleId="InformationTok">
+  <w:style w:customStyle="1" w:styleId="InformationTok" w:type="character">
     <w:name w:val="InformationTok"/>
     <w:basedOn w:val="VerbatimChar"/>
     <w:rPr>
@@ -1418,7 +1519,7 @@
       <w:i/>
     </w:rPr>
   </w:style>
-  <w:style w:type="character" w:customStyle="1" w:styleId="WarningTok">
+  <w:style w:customStyle="1" w:styleId="WarningTok" w:type="character">
     <w:name w:val="WarningTok"/>
     <w:basedOn w:val="VerbatimChar"/>
     <w:rPr>
@@ -1427,7 +1528,7 @@
       <w:i/>
     </w:rPr>
   </w:style>
-  <w:style w:type="character" w:customStyle="1" w:styleId="AlertTok">
+  <w:style w:customStyle="1" w:styleId="AlertTok" w:type="character">
     <w:name w:val="AlertTok"/>
     <w:basedOn w:val="VerbatimChar"/>
     <w:rPr>
@@ -1435,7 +1536,7 @@
       <w:b/>
     </w:rPr>
   </w:style>
-  <w:style w:type="character" w:customStyle="1" w:styleId="ErrorTok">
+  <w:style w:customStyle="1" w:styleId="ErrorTok" w:type="character">
     <w:name w:val="ErrorTok"/>
     <w:basedOn w:val="VerbatimChar"/>
     <w:rPr>
@@ -1443,7 +1544,7 @@
       <w:b/>
     </w:rPr>
   </w:style>
-  <w:style w:type="character" w:customStyle="1" w:styleId="NormalTok">
+  <w:style w:customStyle="1" w:styleId="NormalTok" w:type="character">
     <w:name w:val="NormalTok"/>
     <w:basedOn w:val="VerbatimChar"/>
     <w:rPr/>

</xml_diff>